<commit_message>
Two challenges: price memo and proposal
</commit_message>
<xml_diff>
--- a/breakout/shared/HOW-IT-WORKS.docx
+++ b/breakout/shared/HOW-IT-WORKS.docx
@@ -30,6 +30,11 @@
       </w:r>
       <w:r>
         <w:t xml:space="preserve"> 40 minutes of group work, then 3 minutes to show it.</w:t>
+      </w:r>
+    </w:p>
+    <w:p>
+      <w:r>
+        <w:t>The cases are simplified so they fit into 40 minutes. They are still real decisions, and you build a real agent network for them. You don't need to know anything about pricing.</w:t>
       </w:r>
     </w:p>
     <w:p>

</xml_diff>